<commit_message>
docs: create technical report for LP2-Zoom project in markdown and word formats
</commit_message>
<xml_diff>
--- a/docs/informe.docx
+++ b/docs/informe.docx
@@ -11,13 +11,6 @@
         <w:t xml:space="preserve">INFORME TÉCNICO DE PROYECTO: LP2-ZOOM</w:t>
       </w:r>
     </w:p>
-    <w:p>
-      <w:r>
-        <w:pict>
-          <v:rect style="width:0;height:1.5pt" o:hralign="center" o:hrstd="t" o:hr="t"/>
-        </w:pict>
-      </w:r>
-    </w:p>
     <w:bookmarkStart w:id="11" w:name="universidad-nacional-de-ingeniería"/>
     <w:p>
       <w:pPr>
@@ -113,9 +106,7 @@
     </w:p>
     <w:p>
       <w:r>
-        <w:pict>
-          <v:rect style="width:0;height:1.5pt" o:hralign="center" o:hrstd="t" o:hr="t"/>
-        </w:pict>
+        <w:br w:type="page"/>
       </w:r>
     </w:p>
     <w:bookmarkEnd w:id="9"/>
@@ -1064,9 +1055,7 @@
     </w:p>
     <w:p>
       <w:r>
-        <w:pict>
-          <v:rect style="width:0;height:1.5pt" o:hralign="center" o:hrstd="t" o:hr="t"/>
-        </w:pict>
+        <w:br w:type="page"/>
       </w:r>
     </w:p>
     <w:bookmarkEnd w:id="12"/>
@@ -1610,9 +1599,7 @@
     </w:p>
     <w:p>
       <w:r>
-        <w:pict>
-          <v:rect style="width:0;height:1.5pt" o:hralign="center" o:hrstd="t" o:hr="t"/>
-        </w:pict>
+        <w:br w:type="page"/>
       </w:r>
     </w:p>
     <w:bookmarkEnd w:id="18"/>
@@ -2850,9 +2837,7 @@
     </w:p>
     <w:p>
       <w:r>
-        <w:pict>
-          <v:rect style="width:0;height:1.5pt" o:hralign="center" o:hrstd="t" o:hr="t"/>
-        </w:pict>
+        <w:br w:type="page"/>
       </w:r>
     </w:p>
     <w:bookmarkEnd w:id="23"/>
@@ -4788,13 +4773,6 @@
         <w:t xml:space="preserve">envuelve la estrategia de captura con inicialización perezosa, control de permisos, logging y fallback automático al simulador si falla la inicialización del hardware.</w:t>
       </w:r>
     </w:p>
-    <w:p>
-      <w:r>
-        <w:pict>
-          <v:rect style="width:0;height:1.5pt" o:hralign="center" o:hrstd="t" o:hr="t"/>
-        </w:pict>
-      </w:r>
-    </w:p>
     <w:bookmarkEnd w:id="53"/>
     <w:bookmarkEnd w:id="54"/>
     <w:bookmarkStart w:id="71" w:name="diagramas-uml-del-proyecto"/>
@@ -6736,9 +6714,7 @@
     </w:p>
     <w:p>
       <w:r>
-        <w:pict>
-          <v:rect style="width:0;height:1.5pt" o:hralign="center" o:hrstd="t" o:hr="t"/>
-        </w:pict>
+        <w:br w:type="page"/>
       </w:r>
     </w:p>
     <w:bookmarkEnd w:id="70"/>
@@ -13340,9 +13316,7 @@
     </w:p>
     <w:p>
       <w:r>
-        <w:pict>
-          <v:rect style="width:0;height:1.5pt" o:hralign="center" o:hrstd="t" o:hr="t"/>
-        </w:pict>
+        <w:br w:type="page"/>
       </w:r>
     </w:p>
     <w:bookmarkEnd w:id="85"/>
@@ -16286,9 +16260,7 @@
     </w:p>
     <w:p>
       <w:r>
-        <w:pict>
-          <v:rect style="width:0;height:1.5pt" o:hralign="center" o:hrstd="t" o:hr="t"/>
-        </w:pict>
+        <w:br w:type="page"/>
       </w:r>
     </w:p>
     <w:bookmarkEnd w:id="93"/>
@@ -19526,9 +19498,7 @@
     </w:p>
     <w:p>
       <w:r>
-        <w:pict>
-          <v:rect style="width:0;height:1.5pt" o:hralign="center" o:hrstd="t" o:hr="t"/>
-        </w:pict>
+        <w:br w:type="page"/>
       </w:r>
     </w:p>
     <w:bookmarkEnd w:id="101"/>
@@ -20751,9 +20721,7 @@
     </w:p>
     <w:p>
       <w:r>
-        <w:pict>
-          <v:rect style="width:0;height:1.5pt" o:hralign="center" o:hrstd="t" o:hr="t"/>
-        </w:pict>
+        <w:br w:type="page"/>
       </w:r>
     </w:p>
     <w:bookmarkEnd w:id="107"/>
@@ -21090,9 +21058,7 @@
     </w:p>
     <w:p>
       <w:r>
-        <w:pict>
-          <v:rect style="width:0;height:1.5pt" o:hralign="center" o:hrstd="t" o:hr="t"/>
-        </w:pict>
+        <w:br w:type="page"/>
       </w:r>
     </w:p>
     <w:bookmarkEnd w:id="112"/>

</xml_diff>

<commit_message>
docs: add technical report in Markdown and remove obsolete Word document
</commit_message>
<xml_diff>
--- a/docs/informe.docx
+++ b/docs/informe.docx
@@ -5014,6 +5014,479 @@
     </w:p>
     <w:bookmarkEnd w:id="58"/>
     <w:bookmarkStart w:id="62" w:name="diagrama-de-actividades-general"/>
+    <w:p>
+      <w:pPr>
+        <w:pStyle w:val="Heading4"/>
+      </w:pPr>
+      <w:r>
+        <w:t>Especificación de Caso de Uso: CU-02 (Admitir / Rechazar Invitados)</w:t>
+      </w:r>
+    </w:p>
+    <w:p/>
+    <w:tbl>
+      <w:tblPr>
+        <w:tblW w:type="auto" w:w="0"/>
+        <w:tblLook w:firstColumn="1" w:firstRow="1" w:lastColumn="0" w:lastRow="0" w:noHBand="0" w:noVBand="1" w:val="04A0"/>
+      </w:tblPr>
+      <w:tblGrid>
+        <w:gridCol w:w="4680"/>
+        <w:gridCol w:w="4680"/>
+      </w:tblGrid>
+      <w:tr>
+        <w:tc>
+          <w:tcPr>
+            <w:tcW w:type="dxa" w:w="3168"/>
+          </w:tcPr>
+          <w:p>
+            <w:r>
+              <w:rPr>
+                <w:rFonts w:ascii="Arial" w:hAnsi="Arial"/>
+                <w:b/>
+                <w:sz w:val="21"/>
+              </w:rPr>
+              <w:t>Código</w:t>
+            </w:r>
+          </w:p>
+        </w:tc>
+        <w:tc>
+          <w:tcPr>
+            <w:tcW w:type="dxa" w:w="6192"/>
+          </w:tcPr>
+          <w:p>
+            <w:r>
+              <w:rPr>
+                <w:rFonts w:ascii="Arial" w:hAnsi="Arial"/>
+                <w:sz w:val="20"/>
+              </w:rPr>
+              <w:t>CU-02</w:t>
+            </w:r>
+          </w:p>
+        </w:tc>
+      </w:tr>
+      <w:tr>
+        <w:tc>
+          <w:tcPr>
+            <w:tcW w:type="dxa" w:w="3168"/>
+          </w:tcPr>
+          <w:p>
+            <w:r>
+              <w:rPr>
+                <w:rFonts w:ascii="Arial" w:hAnsi="Arial"/>
+                <w:b/>
+                <w:sz w:val="21"/>
+              </w:rPr>
+              <w:t>Nombre</w:t>
+            </w:r>
+          </w:p>
+        </w:tc>
+        <w:tc>
+          <w:tcPr>
+            <w:tcW w:type="dxa" w:w="6192"/>
+          </w:tcPr>
+          <w:p>
+            <w:r>
+              <w:rPr>
+                <w:rFonts w:ascii="Arial" w:hAnsi="Arial"/>
+                <w:sz w:val="20"/>
+              </w:rPr>
+              <w:t>Admitir / Rechazar Invitados</w:t>
+            </w:r>
+          </w:p>
+        </w:tc>
+      </w:tr>
+      <w:tr>
+        <w:tc>
+          <w:tcPr>
+            <w:tcW w:type="dxa" w:w="3168"/>
+          </w:tcPr>
+          <w:p>
+            <w:r>
+              <w:rPr>
+                <w:rFonts w:ascii="Arial" w:hAnsi="Arial"/>
+                <w:b/>
+                <w:sz w:val="21"/>
+              </w:rPr>
+              <w:t>Actor principal</w:t>
+            </w:r>
+          </w:p>
+        </w:tc>
+        <w:tc>
+          <w:tcPr>
+            <w:tcW w:type="dxa" w:w="6192"/>
+          </w:tcPr>
+          <w:p>
+            <w:r>
+              <w:rPr>
+                <w:rFonts w:ascii="Arial" w:hAnsi="Arial"/>
+                <w:sz w:val="20"/>
+              </w:rPr>
+              <w:t>Anfitrión (Host / Docente) (Usuario que administra la videoconferencia).</w:t>
+            </w:r>
+          </w:p>
+        </w:tc>
+      </w:tr>
+      <w:tr>
+        <w:tc>
+          <w:tcPr>
+            <w:tcW w:type="dxa" w:w="3168"/>
+          </w:tcPr>
+          <w:p>
+            <w:r>
+              <w:rPr>
+                <w:rFonts w:ascii="Arial" w:hAnsi="Arial"/>
+                <w:b/>
+                <w:sz w:val="21"/>
+              </w:rPr>
+              <w:t>Actores secundarios</w:t>
+            </w:r>
+          </w:p>
+        </w:tc>
+        <w:tc>
+          <w:tcPr>
+            <w:tcW w:type="dxa" w:w="6192"/>
+          </w:tcPr>
+          <w:p>
+            <w:r>
+              <w:rPr>
+                <w:rFonts w:ascii="Arial" w:hAnsi="Arial"/>
+                <w:sz w:val="20"/>
+              </w:rPr>
+              <w:t>Invitado (Guest / Estudiante) (Usuario en sala de espera), Servidor (ManejadorCliente), Base de Datos (Supabase Cloud PostgreSQL).</w:t>
+            </w:r>
+          </w:p>
+        </w:tc>
+      </w:tr>
+      <w:tr>
+        <w:tc>
+          <w:tcPr>
+            <w:tcW w:type="dxa" w:w="3168"/>
+          </w:tcPr>
+          <w:p>
+            <w:r>
+              <w:rPr>
+                <w:rFonts w:ascii="Arial" w:hAnsi="Arial"/>
+                <w:b/>
+                <w:sz w:val="21"/>
+              </w:rPr>
+              <w:t>Objetivo</w:t>
+            </w:r>
+          </w:p>
+        </w:tc>
+        <w:tc>
+          <w:tcPr>
+            <w:tcW w:type="dxa" w:w="6192"/>
+          </w:tcPr>
+          <w:p>
+            <w:r>
+              <w:rPr>
+                <w:rFonts w:ascii="Arial" w:hAnsi="Arial"/>
+                <w:sz w:val="20"/>
+              </w:rPr>
+              <w:t>Permitir al Anfitrión moderar el acceso de los Invitados que se encuentran en la sala de espera en tiempo real, aprobando o denegando su ingreso a la reunión.</w:t>
+            </w:r>
+          </w:p>
+        </w:tc>
+      </w:tr>
+      <w:tr>
+        <w:tc>
+          <w:tcPr>
+            <w:tcW w:type="dxa" w:w="3168"/>
+          </w:tcPr>
+          <w:p>
+            <w:r>
+              <w:rPr>
+                <w:rFonts w:ascii="Arial" w:hAnsi="Arial"/>
+                <w:b/>
+                <w:sz w:val="21"/>
+              </w:rPr>
+              <w:t>Precondición</w:t>
+            </w:r>
+          </w:p>
+        </w:tc>
+        <w:tc>
+          <w:tcPr>
+            <w:tcW w:type="dxa" w:w="6192"/>
+          </w:tcPr>
+          <w:p>
+            <w:r>
+              <w:rPr>
+                <w:rFonts w:ascii="Arial" w:hAnsi="Arial"/>
+                <w:sz w:val="20"/>
+              </w:rPr>
+              <w:t>1. El Anfitrión debe haber creado una sala activa en el sistema y estar en la pantalla de espera del Host (HOST_WAITING).</w:t>
+              <w:br/>
+              <w:t>2. Uno o más Invitados deben haber enviado una solicitud de unión (JOIN_ROOM_REQUEST) con el código de 6 caracteres y encontrarse registrados en estado "PENDIENTE" en la tabla SolicitudesSala de Supabase.</w:t>
+            </w:r>
+          </w:p>
+        </w:tc>
+      </w:tr>
+      <w:tr>
+        <w:tc>
+          <w:tcPr>
+            <w:tcW w:type="dxa" w:w="3168"/>
+          </w:tcPr>
+          <w:p>
+            <w:r>
+              <w:rPr>
+                <w:rFonts w:ascii="Arial" w:hAnsi="Arial"/>
+                <w:b/>
+                <w:sz w:val="21"/>
+              </w:rPr>
+              <w:t>Postcondición</w:t>
+            </w:r>
+          </w:p>
+        </w:tc>
+        <w:tc>
+          <w:tcPr>
+            <w:tcW w:type="dxa" w:w="6192"/>
+          </w:tcPr>
+          <w:p>
+            <w:r>
+              <w:rPr>
+                <w:rFonts w:ascii="Arial" w:hAnsi="Arial"/>
+                <w:sz w:val="20"/>
+              </w:rPr>
+              <w:t>1. El registro del Invitado en la tabla SolicitudesSala cambia de "PENDIENTE" a "ACCEPTED" (Aceptado) o "RECHAZADO" (Rechazado).</w:t>
+              <w:br/>
+              <w:t>2. Si es admitido, se inserta una fila en ParticipantesSala con estado "ACTIVO" y el Invitado transiciona al estado "INVITADO_ADMITIDO", esperando la orden de inicio oficial.</w:t>
+              <w:br/>
+              <w:t>3. Si es rechazado, se le notifica por red y regresa al selector principal (SELECTOR).</w:t>
+              <w:br/>
+              <w:t>4. Se actualiza el listado gráfico de solicitudes en la UI del Host.</w:t>
+            </w:r>
+          </w:p>
+        </w:tc>
+      </w:tr>
+      <w:tr>
+        <w:tc>
+          <w:tcPr>
+            <w:tcW w:type="dxa" w:w="3168"/>
+          </w:tcPr>
+          <w:p>
+            <w:r>
+              <w:rPr>
+                <w:rFonts w:ascii="Arial" w:hAnsi="Arial"/>
+                <w:b/>
+                <w:sz w:val="21"/>
+              </w:rPr>
+              <w:t>Flujo principal</w:t>
+            </w:r>
+          </w:p>
+        </w:tc>
+        <w:tc>
+          <w:tcPr>
+            <w:tcW w:type="dxa" w:w="6192"/>
+          </w:tcPr>
+          <w:p>
+            <w:r>
+              <w:rPr>
+                <w:rFonts w:ascii="Arial" w:hAnsi="Arial"/>
+                <w:sz w:val="20"/>
+              </w:rPr>
+              <w:t>1. El Invitado solicita unirse enviando la trama JOIN_ROOM_REQUEST. El Servidor registra la solicitud en Supabase como "PENDIENTE" y bloquea la interfaz del Invitado.</w:t>
+              <w:br/>
+              <w:t>2. El Servidor recupera las solicitudes pendientes de la sala en Supabase y las envía al Host en la trama WAITING_ROOM_UPDATE.</w:t>
+              <w:br/>
+              <w:t>3. El cliente del Anfitrión recibe la trama y actualiza de forma segura la lista gráfica JList con los nombres de los candidatos en espera (dentro del Event Dispatch Thread mediante SwingUtilities.invokeLater).</w:t>
+              <w:br/>
+              <w:t>4. El Anfitrión selecciona al Invitado de la lista en espera y hace clic en el botón "Admitir".</w:t>
+              <w:br/>
+              <w:t>5. El cliente del Anfitrión envía una trama JSON de tipo ADMIT_USER con el mensaje "ACEPTAR" y el ID del Invitado seleccionado por el socket TCP.</w:t>
+              <w:br/>
+              <w:t>6. El hilo ManejadorCliente en el servidor recibe la trama, interpreta el comando y, mediante DBProxy, actualiza la solicitud en la tabla SolicitudesSala a estado "ACCEPTED".</w:t>
+              <w:br/>
+              <w:t>7. El Servidor inserta al Invitado en la tabla ParticipantesSala con estado "ACTIVO" y con la fecha y hora de ingreso.</w:t>
+              <w:br/>
+              <w:t>8. El Servidor envía al cliente del Invitado una trama JSON de tipo ADMIT_USER con el mensaje "ACCEPTED".</w:t>
+              <w:br/>
+              <w:t>9. El cliente del Invitado procesa la trama y actualiza su estado visual en pantalla a "Invitado Admitido" (Espera de inicio oficial de la reunión por parte del Host).</w:t>
+            </w:r>
+          </w:p>
+        </w:tc>
+      </w:tr>
+      <w:tr>
+        <w:tc>
+          <w:tcPr>
+            <w:tcW w:type="dxa" w:w="3168"/>
+          </w:tcPr>
+          <w:p>
+            <w:r>
+              <w:rPr>
+                <w:rFonts w:ascii="Arial" w:hAnsi="Arial"/>
+                <w:b/>
+                <w:sz w:val="21"/>
+              </w:rPr>
+              <w:t>Flujo alternativo</w:t>
+            </w:r>
+          </w:p>
+        </w:tc>
+        <w:tc>
+          <w:tcPr>
+            <w:tcW w:type="dxa" w:w="6192"/>
+          </w:tcPr>
+          <w:p>
+            <w:r>
+              <w:rPr>
+                <w:rFonts w:ascii="Arial" w:hAnsi="Arial"/>
+                <w:sz w:val="20"/>
+              </w:rPr>
+              <w:t>4a. El Anfitrión rechaza la solicitud:</w:t>
+              <w:br/>
+              <w:t>1. En el paso 4, el Anfitrión selecciona al candidato en espera y hace clic en el botón "Rechazar".</w:t>
+              <w:br/>
+              <w:t>2. El cliente envía la trama ADMIT_USER con el mensaje "RECHAZAR" y el ID del Invitado.</w:t>
+              <w:br/>
+              <w:t>3. El Servidor recibe el comando, actualiza el registro en la tabla SolicitudesSala a estado "RECHAZADO" en Supabase y envía la trama ADMIT_USER con el mensaje "REJECTED" al socket del Invitado.</w:t>
+              <w:br/>
+              <w:t>4. El cliente del Invitado recibe la trama de rechazo, sale de la pantalla de bloqueo y regresa al panel selector (SELECTOR) mostrando el aviso de que fue rechazado (Fin del flujo alternativo).</w:t>
+            </w:r>
+          </w:p>
+        </w:tc>
+      </w:tr>
+      <w:tr>
+        <w:tc>
+          <w:tcPr>
+            <w:tcW w:type="dxa" w:w="3168"/>
+          </w:tcPr>
+          <w:p>
+            <w:r>
+              <w:rPr>
+                <w:rFonts w:ascii="Arial" w:hAnsi="Arial"/>
+                <w:b/>
+                <w:sz w:val="21"/>
+              </w:rPr>
+              <w:t>Reglas de negocio</w:t>
+            </w:r>
+          </w:p>
+        </w:tc>
+        <w:tc>
+          <w:tcPr>
+            <w:tcW w:type="dxa" w:w="6192"/>
+          </w:tcPr>
+          <w:p>
+            <w:r>
+              <w:rPr>
+                <w:rFonts w:ascii="Arial" w:hAnsi="Arial"/>
+                <w:sz w:val="20"/>
+              </w:rPr>
+              <w:t>RN-01 (Aislamiento de la BD - Regla de Oro): Toda modificación física de los estados de admisión en SolicitudesSala y ParticipantesSala se realiza de forma exclusiva en el Servidor a través del proxy DBProxy. El cliente jamás ejecuta sentencias JDBC directas.</w:t>
+              <w:br/>
+              <w:t>RN-02 (Concurrencia Segura en Swing): Las actualizaciones asíncronas de la lista de espera recibidas en la trama WAITING_ROOM_UPDATE se gestionan por el hilo de red secundario (HiloEscuchaCliente) y se pintan en la interfaz gráfica delegando en el EDT mediante SwingUtilities.invokeLater(...).</w:t>
+            </w:r>
+          </w:p>
+        </w:tc>
+      </w:tr>
+      <w:tr>
+        <w:tc>
+          <w:tcPr>
+            <w:tcW w:type="dxa" w:w="3168"/>
+          </w:tcPr>
+          <w:p>
+            <w:r>
+              <w:rPr>
+                <w:rFonts w:ascii="Arial" w:hAnsi="Arial"/>
+                <w:b/>
+                <w:sz w:val="21"/>
+              </w:rPr>
+              <w:t>Datos de entrada</w:t>
+            </w:r>
+          </w:p>
+        </w:tc>
+        <w:tc>
+          <w:tcPr>
+            <w:tcW w:type="dxa" w:w="6192"/>
+          </w:tcPr>
+          <w:p>
+            <w:r>
+              <w:rPr>
+                <w:rFonts w:ascii="Arial" w:hAnsi="Arial"/>
+                <w:sz w:val="20"/>
+              </w:rPr>
+              <w:t>Trama JSON (MensajeSocket) enviada por el Host:</w:t>
+              <w:br/>
+              <w:t>- type: "ADMIT_USER" (String)</w:t>
+              <w:br/>
+              <w:t>- roomCode: Código alfanumérico de la sala (String)</w:t>
+              <w:br/>
+              <w:t>- userId: ID numérico del Invitado a moderar (int)</w:t>
+              <w:br/>
+              <w:t>- message: "ACEPTAR" o "RECHAZAR" (String)</w:t>
+            </w:r>
+          </w:p>
+        </w:tc>
+      </w:tr>
+      <w:tr>
+        <w:tc>
+          <w:tcPr>
+            <w:tcW w:type="dxa" w:w="3168"/>
+          </w:tcPr>
+          <w:p>
+            <w:r>
+              <w:rPr>
+                <w:rFonts w:ascii="Arial" w:hAnsi="Arial"/>
+                <w:b/>
+                <w:sz w:val="21"/>
+              </w:rPr>
+              <w:t>Datos de salida</w:t>
+            </w:r>
+          </w:p>
+        </w:tc>
+        <w:tc>
+          <w:tcPr>
+            <w:tcW w:type="dxa" w:w="6192"/>
+          </w:tcPr>
+          <w:p>
+            <w:r>
+              <w:rPr>
+                <w:rFonts w:ascii="Arial" w:hAnsi="Arial"/>
+                <w:sz w:val="20"/>
+              </w:rPr>
+              <w:t>Trama JSON (MensajeSocket) enviada por el Servidor al Invitado:</w:t>
+              <w:br/>
+              <w:t>- type: "ADMIT_USER" (String)</w:t>
+              <w:br/>
+              <w:t>- message: "ACCEPTED" o "REJECTED" (String)</w:t>
+            </w:r>
+          </w:p>
+        </w:tc>
+      </w:tr>
+      <w:tr>
+        <w:tc>
+          <w:tcPr>
+            <w:tcW w:type="dxa" w:w="3168"/>
+          </w:tcPr>
+          <w:p>
+            <w:r>
+              <w:rPr>
+                <w:rFonts w:ascii="Arial" w:hAnsi="Arial"/>
+                <w:b/>
+                <w:sz w:val="21"/>
+              </w:rPr>
+              <w:t>Excepciones</w:t>
+            </w:r>
+          </w:p>
+        </w:tc>
+        <w:tc>
+          <w:tcPr>
+            <w:tcW w:type="dxa" w:w="6192"/>
+          </w:tcPr>
+          <w:p>
+            <w:r>
+              <w:rPr>
+                <w:rFonts w:ascii="Arial" w:hAnsi="Arial"/>
+                <w:sz w:val="20"/>
+              </w:rPr>
+              <w:t>EX-01: Desconexión abrupta de red de un Invitado en espera:</w:t>
+              <w:br/>
+              <w:t>1. Si el socket físico de un Invitado se cierra inesperadamente mientras está en espera, el Servidor captura la excepción de I/O.</w:t>
+              <w:br/>
+              <w:t>2. El Servidor ejecuta el método de limpieza desconectar(), elimina la solicitud pendiente de SolicitudesSala y difunde una nueva trama WAITING_ROOM_UPDATE al Anfitrión para remover el candidato huérfano de la lista de la interfaz (Fin del caso de uso).</w:t>
+            </w:r>
+          </w:p>
+        </w:tc>
+      </w:tr>
+    </w:tbl>
+    <w:p/>
     <w:p>
       <w:pPr>
         <w:pStyle w:val="Heading4"/>

</xml_diff>